<commit_message>
Document post-evaluation robustness fixes
</commit_message>
<xml_diff>
--- a/report/Production_Multimodal_RAG_Final_Report.docx
+++ b/report/Production_Multimodal_RAG_Final_Report.docx
@@ -9380,6 +9380,341 @@
     <w:p>
       <w:r>
         <w:t>The principal lesson is that multimodal retrieval is not solved merely by adding images. Visual evidence must be converted into searchable, uncertainty-aware representations, linked to document structure, and checked against authoritative text. Likewise, advanced retrieval components are valuable only when their effect is measured on a fixed dataset. This observation-driven process produced a stronger and more defensible final RAG architecture.</w:t>
+      </w:r>
+    </w:p>
+    <w:p>
+      <w:r>
+        <w:br w:type="page"/>
+      </w:r>
+    </w:p>
+    <w:p>
+      <w:pPr>
+        <w:pStyle w:val="Heading1"/>
+      </w:pPr>
+      <w:r>
+        <w:t>Appendix A – Post-Evaluation Robustness Fixes</w:t>
+      </w:r>
+    </w:p>
+    <w:p>
+      <w:r>
+        <w:t>The final 40-question RAGAS run was completed before the following submission and runtime-ingestion fixes were added. These changes improve robustness, diagnostics and demonstration usability, but they were not evaluated in a new controlled run. The reported RAGAS scores therefore must not be used as evidence that these fixes improved the evaluated core architecture.</w:t>
+      </w:r>
+    </w:p>
+    <w:tbl>
+      <w:tblPr>
+        <w:tblStyle w:val="TableGrid"/>
+        <w:tblW w:type="auto" w:w="0"/>
+        <w:tblLook w:firstColumn="1" w:firstRow="1" w:lastColumn="0" w:lastRow="0" w:noHBand="0" w:noVBand="1" w:val="04A0"/>
+      </w:tblPr>
+      <w:tblGrid>
+        <w:gridCol w:w="2520"/>
+        <w:gridCol w:w="2520"/>
+        <w:gridCol w:w="2520"/>
+        <w:gridCol w:w="2520"/>
+      </w:tblGrid>
+      <w:tr>
+        <w:tc>
+          <w:tcPr>
+            <w:tcW w:type="dxa" w:w="2520"/>
+          </w:tcPr>
+          <w:p>
+            <w:r>
+              <w:t>Fix</w:t>
+            </w:r>
+          </w:p>
+        </w:tc>
+        <w:tc>
+          <w:tcPr>
+            <w:tcW w:type="dxa" w:w="2520"/>
+          </w:tcPr>
+          <w:p>
+            <w:r>
+              <w:t>Motivation</w:t>
+            </w:r>
+          </w:p>
+        </w:tc>
+        <w:tc>
+          <w:tcPr>
+            <w:tcW w:type="dxa" w:w="2520"/>
+          </w:tcPr>
+          <w:p>
+            <w:r>
+              <w:t>Validation</w:t>
+            </w:r>
+          </w:p>
+        </w:tc>
+        <w:tc>
+          <w:tcPr>
+            <w:tcW w:type="dxa" w:w="2520"/>
+          </w:tcPr>
+          <w:p>
+            <w:r>
+              <w:t>Metric status</w:t>
+            </w:r>
+          </w:p>
+        </w:tc>
+      </w:tr>
+      <w:tr>
+        <w:tc>
+          <w:tcPr>
+            <w:tcW w:type="dxa" w:w="2520"/>
+          </w:tcPr>
+          <w:p>
+            <w:r>
+              <w:t>Runtime vision captions</w:t>
+            </w:r>
+          </w:p>
+        </w:tc>
+        <w:tc>
+          <w:tcPr>
+            <w:tcW w:type="dxa" w:w="2520"/>
+          </w:tcPr>
+          <w:p>
+            <w:r>
+              <w:t>Generate captions for uploaded images and PDF pages while retaining OCR/native text.</w:t>
+            </w:r>
+          </w:p>
+        </w:tc>
+        <w:tc>
+          <w:tcPr>
+            <w:tcW w:type="dxa" w:w="2520"/>
+          </w:tcPr>
+          <w:p>
+            <w:r>
+              <w:t>A mounting-hole image produced the correct 10.2 mm and 11.4 mm relationships.</w:t>
+            </w:r>
+          </w:p>
+        </w:tc>
+        <w:tc>
+          <w:tcPr>
+            <w:tcW w:type="dxa" w:w="2520"/>
+          </w:tcPr>
+          <w:p>
+            <w:r>
+              <w:t>Not measured; reported scores are unchanged.</w:t>
+            </w:r>
+          </w:p>
+        </w:tc>
+      </w:tr>
+      <w:tr>
+        <w:tc>
+          <w:tcPr>
+            <w:tcW w:type="dxa" w:w="2520"/>
+          </w:tcPr>
+          <w:p>
+            <w:r>
+              <w:t>Separate OCR and caption chunks</w:t>
+            </w:r>
+          </w:p>
+        </w:tc>
+        <w:tc>
+          <w:tcPr>
+            <w:tcW w:type="dxa" w:w="2520"/>
+          </w:tcPr>
+          <w:p>
+            <w:r>
+              <w:t>Preserve exact OCR text and add a searchable visual interpretation linked to the image.</w:t>
+            </w:r>
+          </w:p>
+        </w:tc>
+        <w:tc>
+          <w:tcPr>
+            <w:tcW w:type="dxa" w:w="2520"/>
+          </w:tcPr>
+          <w:p>
+            <w:r>
+              <w:t>Both chunks and the original image path were verified.</w:t>
+            </w:r>
+          </w:p>
+        </w:tc>
+        <w:tc>
+          <w:tcPr>
+            <w:tcW w:type="dxa" w:w="2520"/>
+          </w:tcPr>
+          <w:p>
+            <w:r>
+              <w:t>Not measured.</w:t>
+            </w:r>
+          </w:p>
+        </w:tc>
+      </w:tr>
+      <w:tr>
+        <w:tc>
+          <w:tcPr>
+            <w:tcW w:type="dxa" w:w="2520"/>
+          </w:tcPr>
+          <w:p>
+            <w:r>
+              <w:t>Spatially detailed caption prompt</w:t>
+            </w:r>
+          </w:p>
+        </w:tc>
+        <w:tc>
+          <w:tcPr>
+            <w:tcW w:type="dxa" w:w="2520"/>
+          </w:tcPr>
+          <w:p>
+            <w:r>
+              <w:t>Preserve dimensions, arrows, locations, pins and other visual relationships.</w:t>
+            </w:r>
+          </w:p>
+        </w:tc>
+        <w:tc>
+          <w:tcPr>
+            <w:tcW w:type="dxa" w:w="2520"/>
+          </w:tcPr>
+          <w:p>
+            <w:r>
+              <w:t>Upper/lower spacing and both hole diameters were distinguished.</w:t>
+            </w:r>
+          </w:p>
+        </w:tc>
+        <w:tc>
+          <w:tcPr>
+            <w:tcW w:type="dxa" w:w="2520"/>
+          </w:tcPr>
+          <w:p>
+            <w:r>
+              <w:t>Single-document functional test only.</w:t>
+            </w:r>
+          </w:p>
+        </w:tc>
+      </w:tr>
+      <w:tr>
+        <w:tc>
+          <w:tcPr>
+            <w:tcW w:type="dxa" w:w="2520"/>
+          </w:tcPr>
+          <w:p>
+            <w:r>
+              <w:t>Caption diagnostics and fallback</w:t>
+            </w:r>
+          </w:p>
+        </w:tc>
+        <w:tc>
+          <w:tcPr>
+            <w:tcW w:type="dxa" w:w="2520"/>
+          </w:tcPr>
+          <w:p>
+            <w:r>
+              <w:t>Report caption failures while retaining usable OCR/native text.</w:t>
+            </w:r>
+          </w:p>
+        </w:tc>
+        <w:tc>
+          <w:tcPr>
+            <w:tcW w:type="dxa" w:w="2520"/>
+          </w:tcPr>
+          <w:p>
+            <w:r>
+              <w:t>The ingest response reports vision_captions, caption_failures and warnings.</w:t>
+            </w:r>
+          </w:p>
+        </w:tc>
+        <w:tc>
+          <w:tcPr>
+            <w:tcW w:type="dxa" w:w="2520"/>
+          </w:tcPr>
+          <w:p>
+            <w:r>
+              <w:t>Reliability fix, not a metric result.</w:t>
+            </w:r>
+          </w:p>
+        </w:tc>
+      </w:tr>
+      <w:tr>
+        <w:tc>
+          <w:tcPr>
+            <w:tcW w:type="dxa" w:w="2520"/>
+          </w:tcPr>
+          <w:p>
+            <w:r>
+              <w:t>Minimal grounding clarification</w:t>
+            </w:r>
+          </w:p>
+        </w:tc>
+        <w:tc>
+          <w:tcPr>
+            <w:tcW w:type="dxa" w:w="2520"/>
+          </w:tcPr>
+          <w:p>
+            <w:r>
+              <w:t>Treat captions as valid evidence for visible labels, dimensions, pins and connections.</w:t>
+            </w:r>
+          </w:p>
+        </w:tc>
+        <w:tc>
+          <w:tcPr>
+            <w:tcW w:type="dxa" w:w="2520"/>
+          </w:tcPr>
+          <w:p>
+            <w:r>
+              <w:t>One end-to-end uploaded-image smoke test passed.</w:t>
+            </w:r>
+          </w:p>
+        </w:tc>
+        <w:tc>
+          <w:tcPr>
+            <w:tcW w:type="dxa" w:w="2520"/>
+          </w:tcPr>
+          <w:p>
+            <w:r>
+              <w:t>Not included in the 40-question evaluation.</w:t>
+            </w:r>
+          </w:p>
+        </w:tc>
+      </w:tr>
+      <w:tr>
+        <w:tc>
+          <w:tcPr>
+            <w:tcW w:type="dxa" w:w="2520"/>
+          </w:tcPr>
+          <w:p>
+            <w:r>
+              <w:t>README and packaging corrections</w:t>
+            </w:r>
+          </w:p>
+        </w:tc>
+        <w:tc>
+          <w:tcPr>
+            <w:tcW w:type="dxa" w:w="2520"/>
+          </w:tcPr>
+          <w:p>
+            <w:r>
+              <w:t>Document startup, snapshot restoration, ingestion behavior and secret exclusion.</w:t>
+            </w:r>
+          </w:p>
+        </w:tc>
+        <w:tc>
+          <w:tcPr>
+            <w:tcW w:type="dxa" w:w="2520"/>
+          </w:tcPr>
+          <w:p>
+            <w:r>
+              <w:t>Commands, ports, snapshot and repository state were audited.</w:t>
+            </w:r>
+          </w:p>
+        </w:tc>
+        <w:tc>
+          <w:tcPr>
+            <w:tcW w:type="dxa" w:w="2520"/>
+          </w:tcPr>
+          <w:p>
+            <w:r>
+              <w:t>No architectural or metric effect.</w:t>
+            </w:r>
+          </w:p>
+        </w:tc>
+      </w:tr>
+    </w:tbl>
+    <w:p>
+      <w:r>
+        <w:t>An attempted query-specific ranking prompt was tested and then reverted. Although it fixed one ambiguous example, it risked overfitting generation to a single retrieval order. The retained change is deliberately narrow: some retrieved contexts may be irrelevant, and image captions are valid evidence for visible information.</w:t>
+      </w:r>
+    </w:p>
+    <w:p>
+      <w:r>
+        <w:t>The evaluated final architecture remains the architecture documented in the main report. These additions are post-evaluation engineering fixes that require a future regression run before any metric-improvement claim can be made.</w:t>
       </w:r>
     </w:p>
     <w:sectPr>

</xml_diff>